<commit_message>
chore: regenerate docs artifacts after audit verification run
Updated generated .docx and project.json after final health check
(calc + docs run on both DEMO and ТЕСТ during audit).

https://claude.ai/code/session_01EUXh9NoaZ7HpixNuaMKahR
</commit_message>
<xml_diff>
--- a/elec-system/projects/ТЕСТ-2025-001_Тестовая_школа/docs/ТЕСТ-2025-001_cable_journal.docx
+++ b/elec-system/projects/ТЕСТ-2025-001_Тестовая_школа/docs/ТЕСТ-2025-001_cable_journal.docx
@@ -1798,7 +1798,7 @@
                 <w:b w:val="0"/>
                 <w:sz w:val="18"/>
               </w:rPr>
-              <w:t>6</w:t>
+              <w:t>10</w:t>
             </w:r>
           </w:p>
         </w:tc>
@@ -3127,7 +3127,7 @@
                 <w:b w:val="0"/>
                 <w:sz w:val="18"/>
               </w:rPr>
-              <w:t>6</w:t>
+              <w:t>10</w:t>
             </w:r>
           </w:p>
         </w:tc>
@@ -4456,7 +4456,7 @@
                 <w:b w:val="0"/>
                 <w:sz w:val="18"/>
               </w:rPr>
-              <w:t>13</w:t>
+              <w:t>16</w:t>
             </w:r>
           </w:p>
         </w:tc>

</xml_diff>